<commit_message>
complete release evidence and manuscript synchronization
</commit_message>
<xml_diff>
--- a/docs/research/kbound/kbound_short_final_draft.docx
+++ b/docs/research/kbound/kbound_short_final_draft.docx
@@ -16797,430 +16797,7 @@
         <w:pStyle w:val="FirstParagraph"/>
       </w:pPr>
       <w:r>
-        <w:t xml:space="preserve">The evidence map uses only unlabeled batches and model outputs, and is instantiated as two</w:t>
-      </w:r>
-      <w:r>
-        <w:t xml:space="preserve"> </w:t>
-      </w:r>
-      <w:r>
-        <w:t xml:space="preserve">label-free panels matched to the two calibration regimes below. On the controlled stress grids</w:t>
-      </w:r>
-      <w:r>
-        <w:t xml:space="preserve"> </w:t>
-      </w:r>
-      <w:r>
-        <w:t xml:space="preserve">(CIFAR-10-C, ImageNet-C, PACS) the base panel is an</w:t>
-      </w:r>
-      <w:r>
-        <w:t xml:space="preserve"> </w:t>
-      </w:r>
-      <m:oMath>
-        <m:r>
-          <m:t>11</m:t>
-        </m:r>
-      </m:oMath>
-      <w:r>
-        <w:t xml:space="preserve">-dimensional vector computed from the</w:t>
-      </w:r>
-      <w:r>
-        <w:t xml:space="preserve"> </w:t>
-      </w:r>
-      <w:r>
-        <w:t xml:space="preserve">frozen softmax</w:t>
-      </w:r>
-      <w:r>
-        <w:t xml:space="preserve"> </w:t>
-      </w:r>
-      <m:oMath>
-        <m:sSub>
-          <m:e>
-            <m:r>
-              <m:t>p</m:t>
-            </m:r>
-          </m:e>
-          <m:sub>
-            <m:r>
-              <m:t>0</m:t>
-            </m:r>
-          </m:sub>
-        </m:sSub>
-      </m:oMath>
-      <w:r>
-        <w:t xml:space="preserve"> </w:t>
-      </w:r>
-      <w:r>
-        <w:t xml:space="preserve">and the adapted softmax</w:t>
-      </w:r>
-      <w:r>
-        <w:t xml:space="preserve"> </w:t>
-      </w:r>
-      <m:oMath>
-        <m:sSub>
-          <m:e>
-            <m:r>
-              <m:t>p</m:t>
-            </m:r>
-          </m:e>
-          <m:sub>
-            <m:r>
-              <m:t>a</m:t>
-            </m:r>
-          </m:sub>
-        </m:sSub>
-      </m:oMath>
-      <w:r>
-        <w:t xml:space="preserve"> </w:t>
-      </w:r>
-      <w:r>
-        <w:t xml:space="preserve">on the adaptation batch: the mean predictive</w:t>
-      </w:r>
-      <w:r>
-        <w:t xml:space="preserve"> </w:t>
-      </w:r>
-      <w:r>
-        <w:t xml:space="preserve">entropy and mean confidence of</w:t>
-      </w:r>
-      <w:r>
-        <w:t xml:space="preserve"> </w:t>
-      </w:r>
-      <m:oMath>
-        <m:sSub>
-          <m:e>
-            <m:r>
-              <m:t>f</m:t>
-            </m:r>
-          </m:e>
-          <m:sub>
-            <m:r>
-              <m:t>0</m:t>
-            </m:r>
-          </m:sub>
-        </m:sSub>
-      </m:oMath>
-      <w:r>
-        <w:t xml:space="preserve"> </w:t>
-      </w:r>
-      <w:r>
-        <w:t xml:space="preserve">and of</w:t>
-      </w:r>
-      <w:r>
-        <w:t xml:space="preserve"> </w:t>
-      </w:r>
-      <m:oMath>
-        <m:sSub>
-          <m:e>
-            <m:r>
-              <m:t>f</m:t>
-            </m:r>
-          </m:e>
-          <m:sub>
-            <m:r>
-              <m:t>a</m:t>
-            </m:r>
-          </m:sub>
-        </m:sSub>
-      </m:oMath>
-      <w:r>
-        <w:t xml:space="preserve">; the normalized marginal (predicted-class)</w:t>
-      </w:r>
-      <w:r>
-        <w:t xml:space="preserve"> </w:t>
-      </w:r>
-      <w:r>
-        <w:t xml:space="preserve">entropy of each; the entropy and marginal-balance drops between them; the fraction of adapted</w:t>
-      </w:r>
-      <w:r>
-        <w:t xml:space="preserve"> </w:t>
-      </w:r>
-      <w:r>
-        <w:t xml:space="preserve">predictions above confidence</w:t>
-      </w:r>
-      <w:r>
-        <w:t xml:space="preserve"> </w:t>
-      </w:r>
-      <m:oMath>
-        <m:r>
-          <m:t>0.9</m:t>
-        </m:r>
-      </m:oMath>
-      <w:r>
-        <w:t xml:space="preserve"> </w:t>
-      </w:r>
-      <w:r>
-        <w:t xml:space="preserve">(a collapse indicator); the</w:t>
-      </w:r>
-      <w:r>
-        <w:t xml:space="preserve"> </w:t>
-      </w:r>
-      <m:oMath>
-        <m:r>
-          <m:rPr>
-            <m:sty m:val="p"/>
-          </m:rPr>
-          <m:t>K</m:t>
-        </m:r>
-        <m:r>
-          <m:rPr>
-            <m:sty m:val="p"/>
-          </m:rPr>
-          <m:t>L</m:t>
-        </m:r>
-      </m:oMath>
-      <w:r>
-        <w:t xml:space="preserve"> </w:t>
-      </w:r>
-      <w:r>
-        <w:t xml:space="preserve">divergence between</w:t>
-      </w:r>
-      <w:r>
-        <w:t xml:space="preserve"> </w:t>
-      </w:r>
-      <w:r>
-        <w:t xml:space="preserve">the adapted and frozen predicted-class marginals; and the</w:t>
-      </w:r>
-      <w:r>
-        <w:t xml:space="preserve"> </w:t>
-      </w:r>
-      <m:oMath>
-        <m:sSub>
-          <m:e>
-            <m:r>
-              <m:t>ℓ</m:t>
-            </m:r>
-          </m:e>
-          <m:sub>
-            <m:r>
-              <m:t>2</m:t>
-            </m:r>
-          </m:sub>
-        </m:sSub>
-      </m:oMath>
-      <w:r>
-        <w:t xml:space="preserve"> </w:t>
-      </w:r>
-      <w:r>
-        <w:t xml:space="preserve">norm of the adapter’s</w:t>
-      </w:r>
-      <w:r>
-        <w:t xml:space="preserve"> </w:t>
-      </w:r>
-      <w:r>
-        <w:t xml:space="preserve">parameter update. On the natural-shift protocols (Camelyon17, iWildCam, Office-Home, RxRx1) a</w:t>
-      </w:r>
-      <w:r>
-        <w:t xml:space="preserve"> </w:t>
-      </w:r>
-      <m:oMath>
-        <m:r>
-          <m:t>16</m:t>
-        </m:r>
-      </m:oMath>
-      <w:r>
-        <w:t xml:space="preserve">-dimensional panel adds distribution- and disagreement-oriented statistics computed from the</w:t>
-      </w:r>
-      <w:r>
-        <w:t xml:space="preserve"> </w:t>
-      </w:r>
-      <w:r>
-        <w:t xml:space="preserve">frozen logits: entropy and confidence quantiles; the frozen/adapted prediction-disagreement rate;</w:t>
-      </w:r>
-      <w:r>
-        <w:t xml:space="preserve"> </w:t>
-      </w:r>
-      <w:r>
-        <w:t xml:space="preserve">the entropy gap; a free-energy source</w:t>
-      </w:r>
-      <m:oMath>
-        <m:r>
-          <m:rPr>
-            <m:sty m:val="p"/>
-          </m:rPr>
-          <m:t>→</m:t>
-        </m:r>
-      </m:oMath>
-      <w:r>
-        <w:t xml:space="preserve">target shift; a batch-vs-running BatchNorm-statistic</w:t>
-      </w:r>
-      <w:r>
-        <w:t xml:space="preserve"> </w:t>
-      </w:r>
-      <m:oMath>
-        <m:r>
-          <m:rPr>
-            <m:sty m:val="p"/>
-          </m:rPr>
-          <m:t>K</m:t>
-        </m:r>
-        <m:r>
-          <m:rPr>
-            <m:sty m:val="p"/>
-          </m:rPr>
-          <m:t>L</m:t>
-        </m:r>
-      </m:oMath>
-      <w:r>
-        <w:t xml:space="preserve">; an ATC-style threshold-accuracy estimate (its threshold fixed on</w:t>
-      </w:r>
-      <w:r>
-        <w:t xml:space="preserve"> </w:t>
-      </w:r>
-      <w:r>
-        <w:rPr>
-          <w:i/>
-          <w:iCs/>
-        </w:rPr>
-        <w:t xml:space="preserve">source</w:t>
-      </w:r>
-      <w:r>
-        <w:t xml:space="preserve"> </w:t>
-      </w:r>
-      <w:r>
-        <w:t xml:space="preserve">labels only, never target labels); and a source</w:t>
-      </w:r>
-      <m:oMath>
-        <m:r>
-          <m:rPr>
-            <m:sty m:val="p"/>
-          </m:rPr>
-          <m:t>→</m:t>
-        </m:r>
-      </m:oMath>
-      <w:r>
-        <w:t xml:space="preserve">target confidence drop. The source-calibrated</w:t>
-      </w:r>
-      <w:r>
-        <w:t xml:space="preserve"> </w:t>
-      </w:r>
-      <w:r>
-        <w:t xml:space="preserve">correctness score</w:t>
-      </w:r>
-      <w:r>
-        <w:t xml:space="preserve"> </w:t>
-      </w:r>
-      <m:oMath>
-        <m:r>
-          <m:t>s</m:t>
-        </m:r>
-      </m:oMath>
-      <w:r>
-        <w:t xml:space="preserve"> </w:t>
-      </w:r>
-      <w:r>
-        <w:t xml:space="preserve">of §</w:t>
-      </w:r>
-      <w:hyperlink w:anchor="sec:theory">
-        <w:r>
-          <w:rPr>
-            <w:rStyle w:val="Hyperlink"/>
-          </w:rPr>
-          <w:t xml:space="preserve">4</w:t>
-        </w:r>
-      </w:hyperlink>
-      <w:r>
-        <w:t xml:space="preserve"> </w:t>
-      </w:r>
-      <w:r>
-        <w:t xml:space="preserve">is operationalized by the adapted-confidence and</w:t>
-      </w:r>
-      <w:r>
-        <w:t xml:space="preserve"> </w:t>
-      </w:r>
-      <w:r>
-        <w:t xml:space="preserve">ATC-style features.</w:t>
-      </w:r>
-      <w:r>
-        <w:t xml:space="preserve"> </w:t>
-      </w:r>
-      <w:r>
-        <w:rPr>
-          <w:smallCaps/>
-        </w:rPr>
-        <w:t xml:space="preserve">KGA</w:t>
-      </w:r>
-      <w:r>
-        <w:t xml:space="preserve"> </w:t>
-      </w:r>
-      <w:r>
-        <w:t xml:space="preserve">does not explicitly estimate the theoretical margin</w:t>
-      </w:r>
-      <w:r>
-        <w:t xml:space="preserve"> </w:t>
-      </w:r>
-      <m:oMath>
-        <m:r>
-          <m:t>M</m:t>
-        </m:r>
-      </m:oMath>
-      <w:r>
-        <w:t xml:space="preserve">; it learns the benefit</w:t>
-      </w:r>
-      <w:r>
-        <w:t xml:space="preserve"> </w:t>
-      </w:r>
-      <m:oMath>
-        <m:acc>
-          <m:accPr>
-            <m:chr m:val="̂"/>
-          </m:accPr>
-          <m:e>
-            <m:r>
-              <m:rPr>
-                <m:sty m:val="p"/>
-              </m:rPr>
-              <m:t>Δ</m:t>
-            </m:r>
-          </m:e>
-        </m:acc>
-        <m:r>
-          <m:rPr>
-            <m:sty m:val="p"/>
-          </m:rPr>
-          <m:t>=</m:t>
-        </m:r>
-        <m:sSub>
-          <m:e>
-            <m:r>
-              <m:t>h</m:t>
-            </m:r>
-          </m:e>
-          <m:sub>
-            <m:r>
-              <m:t>θ</m:t>
-            </m:r>
-          </m:sub>
-        </m:sSub>
-        <m:r>
-          <m:rPr>
-            <m:sty m:val="p"/>
-          </m:rPr>
-          <m:t>(</m:t>
-        </m:r>
-        <m:r>
-          <m:t>Z</m:t>
-        </m:r>
-        <m:r>
-          <m:rPr>
-            <m:sty m:val="p"/>
-          </m:rPr>
-          <m:t>)</m:t>
-        </m:r>
-      </m:oMath>
-      <w:r>
-        <w:t xml:space="preserve"> </w:t>
-      </w:r>
-      <w:r>
-        <w:t xml:space="preserve">directly from the full evidence vector</w:t>
-      </w:r>
-      <w:r>
-        <w:t xml:space="preserve"> </w:t>
-      </w:r>
-      <m:oMath>
-        <m:r>
-          <m:t>Z</m:t>
-        </m:r>
-      </m:oMath>
-      <w:r>
-        <w:t xml:space="preserve">.</w:t>
+        <w:t>The evidence map uses only unlabeled batches and model outputs. In the promoted per-condition artifacts retained by this release, it is an 11-dimensional vector computed from the frozen and adapted softmax outputs: mean predictive entropy and confidence; normalized marginal entropy; entropy and marginal-balance drops; the fraction of adapted predictions above confidence 0.9; the KL divergence between adapted and frozen predicted-class marginals; and the ℓ₂ norm of the parameter update. An exploratory 16-feature natural-shift panel is not used to support a promoted result. KGA estimates Δ directly from the retained evidence vector; it does not estimate the population margin M.</w:t>
       </w:r>
     </w:p>
     <w:p>
@@ -17228,253 +16805,7 @@
         <w:pStyle w:val="BodyText"/>
       </w:pPr>
       <w:r>
-        <w:t xml:space="preserve">The benefit model predicts</w:t>
-      </w:r>
-      <w:r>
-        <w:t xml:space="preserve"> </w:t>
-      </w:r>
-      <m:oMath>
-        <m:acc>
-          <m:accPr>
-            <m:chr m:val="̂"/>
-          </m:accPr>
-          <m:e>
-            <m:r>
-              <m:rPr>
-                <m:sty m:val="p"/>
-              </m:rPr>
-              <m:t>Δ</m:t>
-            </m:r>
-          </m:e>
-        </m:acc>
-        <m:r>
-          <m:rPr>
-            <m:sty m:val="p"/>
-          </m:rPr>
-          <m:t>=</m:t>
-        </m:r>
-        <m:sSub>
-          <m:e>
-            <m:r>
-              <m:t>h</m:t>
-            </m:r>
-          </m:e>
-          <m:sub>
-            <m:r>
-              <m:t>θ</m:t>
-            </m:r>
-          </m:sub>
-        </m:sSub>
-        <m:r>
-          <m:rPr>
-            <m:sty m:val="p"/>
-          </m:rPr>
-          <m:t>(</m:t>
-        </m:r>
-        <m:r>
-          <m:t>Z</m:t>
-        </m:r>
-        <m:r>
-          <m:rPr>
-            <m:sty m:val="p"/>
-          </m:rPr>
-          <m:t>)</m:t>
-        </m:r>
-      </m:oMath>
-      <w:r>
-        <w:t xml:space="preserve"> </w:t>
-      </w:r>
-      <w:r>
-        <w:t xml:space="preserve">from labeled development conditions;</w:t>
-      </w:r>
-      <w:r>
-        <w:t xml:space="preserve"> </w:t>
-      </w:r>
-      <m:oMath>
-        <m:sSub>
-          <m:e>
-            <m:r>
-              <m:t>h</m:t>
-            </m:r>
-          </m:e>
-          <m:sub>
-            <m:r>
-              <m:t>θ</m:t>
-            </m:r>
-          </m:sub>
-        </m:sSub>
-      </m:oMath>
-      <w:r>
-        <w:t xml:space="preserve"> </w:t>
-      </w:r>
-      <w:r>
-        <w:t xml:space="preserve">is a gradient-boosted regression tree (scikit-learn</w:t>
-      </w:r>
-      <w:r>
-        <w:t xml:space="preserve"> </w:t>
-      </w:r>
-      <w:r>
-        <w:rPr>
-          <w:rStyle w:val="VerbatimChar"/>
-        </w:rPr>
-        <w:t xml:space="preserve">GradientBoostingRegressor</w:t>
-      </w:r>
-      <w:r>
-        <w:t xml:space="preserve">, squared error,</w:t>
-      </w:r>
-      <w:r>
-        <w:t xml:space="preserve"> </w:t>
-      </w:r>
-      <m:oMath>
-        <m:r>
-          <m:t>250</m:t>
-        </m:r>
-      </m:oMath>
-      <w:r>
-        <w:t xml:space="preserve"> </w:t>
-      </w:r>
-      <w:r>
-        <w:t xml:space="preserve">trees, depth</w:t>
-      </w:r>
-      <w:r>
-        <w:t xml:space="preserve"> </w:t>
-      </w:r>
-      <m:oMath>
-        <m:r>
-          <m:t>2</m:t>
-        </m:r>
-      </m:oMath>
-      <w:r>
-        <w:t xml:space="preserve">, learning rate</w:t>
-      </w:r>
-      <w:r>
-        <w:t xml:space="preserve"> </w:t>
-      </w:r>
-      <m:oMath>
-        <m:r>
-          <m:t>0.05</m:t>
-        </m:r>
-      </m:oMath>
-      <w:r>
-        <w:t xml:space="preserve">,</w:t>
-      </w:r>
-      <w:r>
-        <w:t xml:space="preserve"> </w:t>
-      </w:r>
-      <w:r>
-        <w:t xml:space="preserve">subsample</w:t>
-      </w:r>
-      <w:r>
-        <w:t xml:space="preserve"> </w:t>
-      </w:r>
-      <m:oMath>
-        <m:r>
-          <m:t>0.8</m:t>
-        </m:r>
-      </m:oMath>
-      <w:r>
-        <w:t xml:space="preserve">, seed</w:t>
-      </w:r>
-      <w:r>
-        <w:t xml:space="preserve"> </w:t>
-      </w:r>
-      <m:oMath>
-        <m:r>
-          <m:t>0</m:t>
-        </m:r>
-      </m:oMath>
-      <w:r>
-        <w:t xml:space="preserve">), refit</w:t>
-      </w:r>
-      <w:r>
-        <w:t xml:space="preserve"> </w:t>
-      </w:r>
-      <w:r>
-        <w:rPr>
-          <w:i/>
-          <w:iCs/>
-        </w:rPr>
-        <w:t xml:space="preserve">per dataset and per candidate adapter</w:t>
-      </w:r>
-      <w:r>
-        <w:t xml:space="preserve"> </w:t>
-      </w:r>
-      <w:r>
-        <w:t xml:space="preserve">rather than shared,</w:t>
-      </w:r>
-      <w:r>
-        <w:t xml:space="preserve"> </w:t>
-      </w:r>
-      <w:r>
-        <w:t xml:space="preserve">so the estimator itself implies no cross-dataset transfer.</w:t>
-      </w:r>
-      <w:r>
-        <w:t xml:space="preserve"> </w:t>
-      </w:r>
-      <w:r>
-        <w:t xml:space="preserve">The complete schema for both panels—exact per-feature formulas and families—is given in</w:t>
-      </w:r>
-      <w:r>
-        <w:t xml:space="preserve"> </w:t>
-      </w:r>
-      <w:r>
-        <w:t xml:space="preserve">Appendix </w:t>
-      </w:r>
-      <w:hyperlink w:anchor="app:evidence-schema">
-        <w:r>
-          <w:rPr>
-            <w:rStyle w:val="Hyperlink"/>
-          </w:rPr>
-          <w:t xml:space="preserve">14</w:t>
-        </w:r>
-      </w:hyperlink>
-      <w:r>
-        <w:t xml:space="preserve"> </w:t>
-      </w:r>
-      <w:r>
-        <w:t xml:space="preserve">(Tables </w:t>
-      </w:r>
-      <w:hyperlink w:anchor="tab:schema-base">
-        <w:r>
-          <w:rPr>
-            <w:rStyle w:val="Hyperlink"/>
-          </w:rPr>
-          <w:t xml:space="preserve">9</w:t>
-        </w:r>
-      </w:hyperlink>
-      <w:r>
-        <w:t xml:space="preserve"> </w:t>
-      </w:r>
-      <w:r>
-        <w:t xml:space="preserve">and </w:t>
-      </w:r>
-      <w:hyperlink w:anchor="tab:schema-rich">
-        <w:r>
-          <w:rPr>
-            <w:rStyle w:val="Hyperlink"/>
-          </w:rPr>
-          <w:t xml:space="preserve">XXIII</w:t>
-        </w:r>
-      </w:hyperlink>
-      <w:r>
-        <w:t xml:space="preserve">), with</w:t>
-      </w:r>
-      <w:r>
-        <w:t xml:space="preserve"> </w:t>
-      </w:r>
-      <w:r>
-        <w:t xml:space="preserve">per-adapter update hyperparameters in Table </w:t>
-      </w:r>
-      <w:hyperlink w:anchor="tab:adapter-hparams">
-        <w:r>
-          <w:rPr>
-            <w:rStyle w:val="Hyperlink"/>
-          </w:rPr>
-          <w:t xml:space="preserve">XXIV</w:t>
-        </w:r>
-      </w:hyperlink>
-      <w:r>
-        <w:t xml:space="preserve">.</w:t>
+        <w:t>The benefit model predicts Δ_hat from labeled development conditions using a gradient-boosted regression tree (squared error, 250 trees, depth 2, learning rate 0.05, subsample 0.8, seed 0), refit per dataset and candidate adapter. The complete promoted 11-feature schema is given in the appendix, with per-adapter update hyperparameters in the following table.</w:t>
       </w:r>
     </w:p>
     <w:bookmarkStart w:id="55" w:name="tab:evidence-map"/>
@@ -17483,64 +16814,7 @@
         <w:pStyle w:val="TableCaption"/>
       </w:pPr>
       <w:r>
-        <w:t xml:space="preserve">Label-free evidence</w:t>
-      </w:r>
-      <w:r>
-        <w:t xml:space="preserve"> </w:t>
-      </w:r>
-      <w:r>
-        <w:rPr>
-          <w:i/>
-          <w:iCs/>
-        </w:rPr>
-        <w:t xml:space="preserve">actually computed</w:t>
-      </w:r>
-      <w:r>
-        <w:t xml:space="preserve"> </w:t>
-      </w:r>
-      <w:r>
-        <w:t xml:space="preserve">by KGA. The</w:t>
-      </w:r>
-      <w:r>
-        <w:t xml:space="preserve"> </w:t>
-      </w:r>
-      <m:oMath>
-        <m:r>
-          <m:t>11</m:t>
-        </m:r>
-      </m:oMath>
-      <w:r>
-        <w:t xml:space="preserve">-dim base panel drives the</w:t>
-      </w:r>
-      <w:r>
-        <w:t xml:space="preserve"> </w:t>
-      </w:r>
-      <w:r>
-        <w:t xml:space="preserve">stress grids; the natural-shift protocols use a</w:t>
-      </w:r>
-      <w:r>
-        <w:t xml:space="preserve"> </w:t>
-      </w:r>
-      <m:oMath>
-        <m:r>
-          <m:t>16</m:t>
-        </m:r>
-      </m:oMath>
-      <w:r>
-        <w:t xml:space="preserve">-dim panel that adds the rows marked</w:t>
-      </w:r>
-      <w:r>
-        <w:t xml:space="preserve"> </w:t>
-      </w:r>
-      <w:r>
-        <w:rPr>
-          <w:i/>
-          <w:iCs/>
-        </w:rPr>
-        <w:t xml:space="preserve">(nat.)</w:t>
-      </w:r>
-      <w:r>
-        <w:t xml:space="preserve">. Exact formulas and per-track subsets are in the configuration files.</w:t>
+        <w:t>Label-free evidence in the promoted per-condition artifacts. Tracks retained only as reconciled summaries do not support a stronger feature-level claim.</w:t>
       </w:r>
     </w:p>
     <w:tbl>
@@ -17617,22 +16891,8 @@
         <w:tc>
           <w:tcPr/>
           <w:p>
-            <w:pPr>
-              <w:pStyle w:val="Compact"/>
-              <w:jc w:val="left"/>
-            </w:pPr>
-            <w:r>
-              <w:t xml:space="preserve">mean entropy, mean confidence, normalized marginal-class entropy; entropy/confidence quantiles</w:t>
-            </w:r>
-            <w:r>
-              <w:t xml:space="preserve"> </w:t>
-            </w:r>
-            <w:r>
-              <w:rPr>
-                <w:i/>
-                <w:iCs/>
-              </w:rPr>
-              <w:t xml:space="preserve">(nat.)</w:t>
+            <w:r>
+              <w:t>mean entropy, mean confidence, normalized marginal-class entropy</w:t>
             </w:r>
           </w:p>
         </w:tc>
@@ -17670,27 +16930,9 @@
         <w:tc>
           <w:tcPr/>
           <w:p>
-            <w:pPr>
-              <w:pStyle w:val="Compact"/>
-              <w:jc w:val="left"/>
-            </w:pPr>
-            <w:r>
-              <w:t xml:space="preserve">mean entropy, mean confidence, normalized marginal entropy, frac. confidence</w:t>
-            </w:r>
-            <w:r>
-              <w:t xml:space="preserve"> </w:t>
-            </w:r>
-            <m:oMath>
-              <m:r>
-                <m:rPr>
-                  <m:sty m:val="p"/>
-                </m:rPr>
-                <m:t>&gt;</m:t>
-              </m:r>
-              <m:r>
-                <m:t>0.9</m:t>
-              </m:r>
-            </m:oMath>
+            <w:r>
+              <w:t>mean entropy, mean confidence, normalized marginal entropy, fraction confidence &gt; 0.9</w:t>
+            </w:r>
           </w:p>
         </w:tc>
       </w:tr>
@@ -17760,12 +17002,8 @@
         <w:tc>
           <w:tcPr/>
           <w:p>
-            <w:pPr>
-              <w:pStyle w:val="Compact"/>
-              <w:jc w:val="left"/>
-            </w:pPr>
-            <w:r>
-              <w:t xml:space="preserve">entropy drop, marginal-balance drop, entropy gap</w:t>
+            <w:r>
+              <w:t>entropy drop, marginal-balance drop</w:t>
             </w:r>
           </w:p>
         </w:tc>
@@ -17774,34 +17012,16 @@
         <w:tc>
           <w:tcPr/>
           <w:p>
-            <w:pPr>
-              <w:pStyle w:val="Compact"/>
-              <w:jc w:val="left"/>
-            </w:pPr>
-            <w:r>
-              <w:t xml:space="preserve">Disagreement</w:t>
-            </w:r>
-          </w:p>
-        </w:tc>
-        <w:tc>
-          <w:tcPr/>
-          <w:p>
-            <w:pPr>
-              <w:pStyle w:val="Compact"/>
-              <w:jc w:val="left"/>
-            </w:pPr>
-            <w:r>
-              <w:t xml:space="preserve">frozen/adapted prediction-disagreement rate</w:t>
-            </w:r>
-            <w:r>
-              <w:t xml:space="preserve"> </w:t>
-            </w:r>
-            <w:r>
-              <w:rPr>
-                <w:i/>
-                <w:iCs/>
-              </w:rPr>
-              <w:t xml:space="preserve">(nat.)</w:t>
+            <w:r>
+              <w:t>Distribution drift</w:t>
+            </w:r>
+          </w:p>
+        </w:tc>
+        <w:tc>
+          <w:tcPr/>
+          <w:p>
+            <w:r>
+              <w:t>adapted-vs-frozen predicted-class marginal KL</w:t>
             </w:r>
           </w:p>
         </w:tc>
@@ -17810,117 +17030,16 @@
         <w:tc>
           <w:tcPr/>
           <w:p>
-            <w:pPr>
-              <w:pStyle w:val="Compact"/>
-              <w:jc w:val="left"/>
-            </w:pPr>
-            <w:r>
-              <w:t xml:space="preserve">Distribution drift</w:t>
-            </w:r>
-          </w:p>
-        </w:tc>
-        <w:tc>
-          <w:tcPr/>
-          <w:p>
-            <w:pPr>
-              <w:pStyle w:val="Compact"/>
-              <w:jc w:val="left"/>
-            </w:pPr>
-            <w:r>
-              <w:t xml:space="preserve">adapted-vs-frozen marginal</w:t>
-            </w:r>
-            <w:r>
-              <w:t xml:space="preserve"> </w:t>
-            </w:r>
-            <m:oMath>
-              <m:r>
-                <m:rPr>
-                  <m:sty m:val="p"/>
-                </m:rPr>
-                <m:t>K</m:t>
-              </m:r>
-              <m:r>
-                <m:rPr>
-                  <m:sty m:val="p"/>
-                </m:rPr>
-                <m:t>L</m:t>
-              </m:r>
-            </m:oMath>
-            <w:r>
-              <w:t xml:space="preserve">; free-energy shift, BN-statistic</w:t>
-            </w:r>
-            <w:r>
-              <w:t xml:space="preserve"> </w:t>
-            </w:r>
-            <m:oMath>
-              <m:r>
-                <m:rPr>
-                  <m:sty m:val="p"/>
-                </m:rPr>
-                <m:t>K</m:t>
-              </m:r>
-              <m:r>
-                <m:rPr>
-                  <m:sty m:val="p"/>
-                </m:rPr>
-                <m:t>L</m:t>
-              </m:r>
-            </m:oMath>
-            <w:r>
-              <w:t xml:space="preserve">, ATC/confidence drop</w:t>
-            </w:r>
-            <w:r>
-              <w:t xml:space="preserve"> </w:t>
-            </w:r>
-            <w:r>
-              <w:rPr>
-                <w:i/>
-                <w:iCs/>
-              </w:rPr>
-              <w:t xml:space="preserve">(nat.)</w:t>
-            </w:r>
-          </w:p>
-        </w:tc>
-      </w:tr>
-      <w:tr>
-        <w:tc>
-          <w:tcPr/>
-          <w:p>
-            <w:pPr>
-              <w:pStyle w:val="Compact"/>
-              <w:jc w:val="left"/>
-            </w:pPr>
-            <w:r>
-              <w:t xml:space="preserve">Update behavior</w:t>
-            </w:r>
-          </w:p>
-        </w:tc>
-        <w:tc>
-          <w:tcPr/>
-          <w:p>
-            <w:pPr>
-              <w:pStyle w:val="Compact"/>
-              <w:jc w:val="left"/>
-            </w:pPr>
-            <m:oMath>
-              <m:sSub>
-                <m:e>
-                  <m:r>
-                    <m:t>ℓ</m:t>
-                  </m:r>
-                </m:e>
-                <m:sub>
-                  <m:r>
-                    <m:t>2</m:t>
-                  </m:r>
-                </m:sub>
-              </m:sSub>
-            </m:oMath>
-            <w:r>
-              <w:t xml:space="preserve"> </w:t>
-            </w:r>
-            <w:r>
-              <w:t xml:space="preserve">norm of the adapter parameter update</w:t>
+            <w:r>
+              <w:t>Update behavior</w:t>
+            </w:r>
+          </w:p>
+        </w:tc>
+        <w:tc>
+          <w:tcPr/>
+          <w:p>
+            <w:r>
+              <w:t>ℓ₂ norm of the adapter parameter update</w:t>
             </w:r>
           </w:p>
         </w:tc>
@@ -19908,200 +19027,17 @@
         <w:pStyle w:val="FirstParagraph"/>
       </w:pPr>
       <w:r>
-        <w:t xml:space="preserve">KGA cannot avoid the cost of proposing an update because candidate adaptation includes forward and</w:t>
-      </w:r>
-      <w:r>
-        <w:t xml:space="preserve"> </w:t>
-      </w:r>
-      <w:r>
-        <w:t xml:space="preserve">backward computation before commitment. A complete profile must separately report frozen inference,</w:t>
-      </w:r>
-      <w:r>
-        <w:t xml:space="preserve"> </w:t>
-      </w:r>
-      <w:r>
-        <w:t xml:space="preserve">candidate adaptation, candidate inference, evidence extraction, benefit-estimator evaluation,</w:t>
-      </w:r>
-      <w:r>
-        <w:t xml:space="preserve"> </w:t>
-      </w:r>
-      <w:r>
-        <w:t xml:space="preserve">model-copy memory, rollback, and end-to-end window latency. The controller’s</w:t>
-      </w:r>
-      <w:r>
-        <w:t xml:space="preserve"> </w:t>
-      </w:r>
-      <w:r>
-        <w:rPr>
-          <w:i/>
-          <w:iCs/>
-        </w:rPr>
-        <w:t xml:space="preserve">added</w:t>
-      </w:r>
-      <w:r>
-        <w:t xml:space="preserve"> </w:t>
-      </w:r>
-      <w:r>
-        <w:t xml:space="preserve">cost is measured in Table </w:t>
-      </w:r>
-      <w:hyperlink w:anchor="tab:cost">
-        <w:r>
-          <w:rPr>
-            <w:rStyle w:val="Hyperlink"/>
-          </w:rPr>
-          <w:t xml:space="preserve">3</w:t>
-        </w:r>
-      </w:hyperlink>
-      <w:r>
-        <w:t xml:space="preserve"> </w:t>
-      </w:r>
-      <w:r>
-        <w:t xml:space="preserve">(</w:t>
-      </w:r>
-      <w:r>
-        <w:rPr>
-          <w:rStyle w:val="VerbatimChar"/>
-        </w:rPr>
-        <w:t xml:space="preserve">scripts/cost_profile.py</w:t>
-      </w:r>
-      <w:r>
-        <w:t xml:space="preserve">; locked artifact</w:t>
-      </w:r>
-      <w:r>
-        <w:t xml:space="preserve"> </w:t>
-      </w:r>
-      <w:r>
-        <w:rPr>
-          <w:rStyle w:val="VerbatimChar"/>
-        </w:rPr>
-        <w:t xml:space="preserve">cost_profile.json</w:t>
-      </w:r>
-      <w:r>
-        <w:t xml:space="preserve">): evidence</w:t>
-      </w:r>
-      <w:r>
-        <w:t xml:space="preserve"> </w:t>
-      </w:r>
-      <w:r>
-        <w:t xml:space="preserve">extraction</w:t>
-      </w:r>
-      <w:r>
-        <w:t xml:space="preserve"> </w:t>
-      </w:r>
-      <m:oMath>
-        <m:r>
-          <m:t>0.074</m:t>
-        </m:r>
-      </m:oMath>
-      <w:r>
-        <w:t xml:space="preserve"> ms and benefit-model evaluation</w:t>
-      </w:r>
-      <w:r>
-        <w:t xml:space="preserve"> </w:t>
-      </w:r>
-      <m:oMath>
-        <m:r>
-          <m:t>0.127</m:t>
-        </m:r>
-      </m:oMath>
-      <w:r>
-        <w:t xml:space="preserve"> ms per decision (</w:t>
-      </w:r>
-      <m:oMath>
-        <m:r>
-          <m:t>0.20</m:t>
-        </m:r>
-      </m:oMath>
-      <w:r>
-        <w:t xml:space="preserve"> ms total),</w:t>
-      </w:r>
-      <w:r>
-        <w:t xml:space="preserve"> </w:t>
-      </w:r>
-      <w:r>
-        <w:t xml:space="preserve">plus one model copy (</w:t>
-      </w:r>
-      <m:oMath>
-        <m:r>
-          <m:t>44.8</m:t>
-        </m:r>
-      </m:oMath>
-      <w:r>
-        <w:t xml:space="preserve"> MB, ResNet-18/CIFAR) for rollback; the benefit model itself is</w:t>
-      </w:r>
-      <w:r>
-        <w:t xml:space="preserve"> </w:t>
-      </w:r>
-      <m:oMath>
-        <m:r>
-          <m:t>195</m:t>
-        </m:r>
-      </m:oMath>
-      <w:r>
-        <w:t xml:space="preserve"> KB. Candidate adaptation and inference are unchanged by KGA—</w:t>
-      </w:r>
-      <m:oMath>
-        <m:sSub>
-          <m:e>
-            <m:r>
-              <m:t>f</m:t>
-            </m:r>
-          </m:e>
-          <m:sub>
-            <m:r>
-              <m:t>a</m:t>
-            </m:r>
-          </m:sub>
-        </m:sSub>
-      </m:oMath>
-      <w:r>
-        <w:t xml:space="preserve"> </w:t>
-      </w:r>
-      <w:r>
-        <w:t xml:space="preserve">is evaluated</w:t>
-      </w:r>
-      <w:r>
-        <w:t xml:space="preserve"> </w:t>
-      </w:r>
-      <w:r>
-        <w:t xml:space="preserve">regardless—and dominate end-to-end latency.</w:t>
+        <w:t>KGA cannot avoid the cost of proposing an update because candidate adaptation includes forward and backward computation before commitment. The controller-only artifact experiments/kbound/results/controller_cost_v1/cost_profile.json measures 0.098 ms for evidence extraction and 0.245 ms for benefit-model evaluation (0.343 ms total) on Apple silicon with Python 3.12.13. The referenced ResNet-18/CIFAR checkpoint is 44.77 MB on disk and the serialized benefit model is 194.9 KB. These environment-specific values exclude candidate adaptation and model inference.</w:t>
       </w:r>
     </w:p>
     <w:bookmarkStart w:id="65" w:name="tab:cost"/>
     <w:p>
       <w:pPr>
         <w:pStyle w:val="TableCaption"/>
+        <w:pageBreakBefore/>
       </w:pPr>
       <w:r>
-        <w:t xml:space="preserve">KGA controller</w:t>
-      </w:r>
-      <w:r>
-        <w:t xml:space="preserve"> </w:t>
-      </w:r>
-      <w:r>
-        <w:rPr>
-          <w:i/>
-          <w:iCs/>
-        </w:rPr>
-        <w:t xml:space="preserve">added</w:t>
-      </w:r>
-      <w:r>
-        <w:t xml:space="preserve"> </w:t>
-      </w:r>
-      <w:r>
-        <w:t xml:space="preserve">cost (ResNet-18/CIFAR, measured via</w:t>
-      </w:r>
-      <w:r>
-        <w:t xml:space="preserve"> </w:t>
-      </w:r>
-      <w:r>
-        <w:rPr>
-          <w:rStyle w:val="VerbatimChar"/>
-        </w:rPr>
-        <w:t xml:space="preserve">scripts/cost_profile.py</w:t>
-      </w:r>
-      <w:r>
-        <w:t xml:space="preserve">). The adaptation/inference step is unchanged by KGA.</w:t>
+        <w:t>KGA controller added cost (ResNet-18/CIFAR, Apple silicon, Python 3.12.13; scripts/recompute/cost_profile.py). Timings are environment-specific and exclude adaptation and inference.</w:t>
       </w:r>
     </w:p>
     <w:tbl>
@@ -20160,17 +19096,8 @@
         <w:tc>
           <w:tcPr/>
           <w:p>
-            <w:pPr>
-              <w:pStyle w:val="Compact"/>
-              <w:jc w:val="center"/>
-            </w:pPr>
-            <m:oMath>
-              <m:r>
-                <m:t>0.074</m:t>
-              </m:r>
-            </m:oMath>
-            <w:r>
-              <w:t xml:space="preserve"> ms</w:t>
+            <w:r>
+              <w:t>0.098 ms</w:t>
             </w:r>
           </w:p>
         </w:tc>
@@ -20191,17 +19118,8 @@
         <w:tc>
           <w:tcPr/>
           <w:p>
-            <w:pPr>
-              <w:pStyle w:val="Compact"/>
-              <w:jc w:val="center"/>
-            </w:pPr>
-            <m:oMath>
-              <m:r>
-                <m:t>0.127</m:t>
-              </m:r>
-            </m:oMath>
-            <w:r>
-              <w:t xml:space="preserve"> ms</w:t>
+            <w:r>
+              <w:t>0.245 ms</w:t>
             </w:r>
           </w:p>
         </w:tc>
@@ -20226,27 +19144,8 @@
         <w:tc>
           <w:tcPr/>
           <w:p>
-            <w:pPr>
-              <w:pStyle w:val="Compact"/>
-              <w:jc w:val="center"/>
-            </w:pPr>
-            <m:oMath>
-              <m:r>
-                <m:rPr>
-                  <m:sty m:val="b"/>
-                </m:rPr>
-                <m:t>0.20</m:t>
-              </m:r>
-            </m:oMath>
-            <w:r>
-              <w:t xml:space="preserve"> </w:t>
-            </w:r>
-            <w:r>
-              <w:rPr>
-                <w:b/>
-                <w:bCs/>
-              </w:rPr>
-              <w:t xml:space="preserve">ms</w:t>
+            <w:r>
+              <w:t>0.343 ms</w:t>
             </w:r>
           </w:p>
         </w:tc>
@@ -20255,29 +19154,16 @@
         <w:tc>
           <w:tcPr/>
           <w:p>
-            <w:pPr>
-              <w:pStyle w:val="Compact"/>
-              <w:jc w:val="left"/>
-            </w:pPr>
-            <w:r>
-              <w:t xml:space="preserve">Rollback model copy (memory)</w:t>
-            </w:r>
-          </w:p>
-        </w:tc>
-        <w:tc>
-          <w:tcPr/>
-          <w:p>
-            <w:pPr>
-              <w:pStyle w:val="Compact"/>
-              <w:jc w:val="center"/>
-            </w:pPr>
-            <m:oMath>
-              <m:r>
-                <m:t>44.8</m:t>
-              </m:r>
-            </m:oMath>
-            <w:r>
-              <w:t xml:space="preserve"> MB</w:t>
+            <w:r>
+              <w:t>Rollback checkpoint (on-disk size)</w:t>
+            </w:r>
+          </w:p>
+        </w:tc>
+        <w:tc>
+          <w:tcPr/>
+          <w:p>
+            <w:r>
+              <w:t>44.77 MB</w:t>
             </w:r>
           </w:p>
         </w:tc>
@@ -20286,29 +19172,16 @@
         <w:tc>
           <w:tcPr/>
           <w:p>
-            <w:pPr>
-              <w:pStyle w:val="Compact"/>
-              <w:jc w:val="left"/>
-            </w:pPr>
-            <w:r>
-              <w:t xml:space="preserve">Benefit model size</w:t>
-            </w:r>
-          </w:p>
-        </w:tc>
-        <w:tc>
-          <w:tcPr/>
-          <w:p>
-            <w:pPr>
-              <w:pStyle w:val="Compact"/>
-              <w:jc w:val="center"/>
-            </w:pPr>
-            <m:oMath>
-              <m:r>
-                <m:t>195</m:t>
-              </m:r>
-            </m:oMath>
-            <w:r>
-              <w:t xml:space="preserve"> KB</w:t>
+            <w:r>
+              <w:t>Serialized benefit model</w:t>
+            </w:r>
+          </w:p>
+        </w:tc>
+        <w:tc>
+          <w:tcPr/>
+          <w:p>
+            <w:r>
+              <w:t>194.9 KB</w:t>
             </w:r>
           </w:p>
         </w:tc>
@@ -25844,236 +24717,7 @@
         <w:pStyle w:val="FirstParagraph"/>
       </w:pPr>
       <w:r>
-        <w:t xml:space="preserve">The one natural-shift track with per-condition logs at</w:t>
-      </w:r>
-      <w:r>
-        <w:t xml:space="preserve"> </w:t>
-      </w:r>
-      <w:r>
-        <w:t xml:space="preserve">multiple seeds is Camelyon17 (</w:t>
-      </w:r>
-      <m:oMath>
-        <m:r>
-          <m:t>4</m:t>
-        </m:r>
-      </m:oMath>
-      <w:r>
-        <w:t xml:space="preserve"> </w:t>
-      </w:r>
-      <w:r>
-        <w:t xml:space="preserve">seeds,</w:t>
-      </w:r>
-      <w:r>
-        <w:t xml:space="preserve"> </w:t>
-      </w:r>
-      <m:oMath>
-        <m:r>
-          <m:t>9</m:t>
-        </m:r>
-      </m:oMath>
-      <w:r>
-        <w:t xml:space="preserve"> </w:t>
-      </w:r>
-      <w:r>
-        <w:t xml:space="preserve">composition-stress conditions/seed). Aggregating the</w:t>
-      </w:r>
-      <w:r>
-        <w:t xml:space="preserve"> </w:t>
-      </w:r>
-      <w:r>
-        <w:t xml:space="preserve">deployed per-seed decisions (</w:t>
-      </w:r>
-      <w:r>
-        <w:rPr>
-          <w:rStyle w:val="VerbatimChar"/>
-        </w:rPr>
-        <w:t xml:space="preserve">scripts/multiseed_natural.py</w:t>
-      </w:r>
-      <w:r>
-        <w:t xml:space="preserve">; locked</w:t>
-      </w:r>
-      <w:r>
-        <w:t xml:space="preserve"> </w:t>
-      </w:r>
-      <w:r>
-        <w:rPr>
-          <w:rStyle w:val="VerbatimChar"/>
-        </w:rPr>
-        <w:t xml:space="preserve">multiseed_camelyon17_*.json</w:t>
-      </w:r>
-      <w:r>
-        <w:t xml:space="preserve">) shows the no-harm outcome is</w:t>
-      </w:r>
-      <w:r>
-        <w:t xml:space="preserve"> </w:t>
-      </w:r>
-      <w:r>
-        <w:rPr>
-          <w:i/>
-          <w:iCs/>
-        </w:rPr>
-        <w:t xml:space="preserve">candidate-dependent</w:t>
-      </w:r>
-      <w:r>
-        <w:t xml:space="preserve"> </w:t>
-      </w:r>
-      <w:r>
-        <w:t xml:space="preserve">and</w:t>
-      </w:r>
-      <w:r>
-        <w:t xml:space="preserve"> </w:t>
-      </w:r>
-      <w:r>
-        <w:t xml:space="preserve">stable only for the milder adapter (Table </w:t>
-      </w:r>
-      <w:hyperlink w:anchor="tab:multiseed">
-        <w:r>
-          <w:rPr>
-            <w:rStyle w:val="Hyperlink"/>
-          </w:rPr>
-          <w:t xml:space="preserve">XIV</w:t>
-        </w:r>
-      </w:hyperlink>
-      <w:r>
-        <w:t xml:space="preserve">): with Tent, KGA is</w:t>
-      </w:r>
-      <w:r>
-        <w:t xml:space="preserve"> </w:t>
-      </w:r>
-      <w:r>
-        <w:rPr>
-          <w:b/>
-          <w:bCs/>
-        </w:rPr>
-        <w:t xml:space="preserve">stable</w:t>
-      </w:r>
-      <w:r>
-        <w:rPr>
-          <w:b/>
-          <w:bCs/>
-        </w:rPr>
-        <w:t xml:space="preserve"> </w:t>
-      </w:r>
-      <w:r>
-        <w:rPr>
-          <w:b/>
-          <w:bCs/>
-        </w:rPr>
-        <w:t xml:space="preserve">no-harm</w:t>
-      </w:r>
-      <w:r>
-        <w:t xml:space="preserve"> </w:t>
-      </w:r>
-      <w:r>
-        <w:t xml:space="preserve">across all four seeds—it ties always-freeze, beats always-adapt, at</w:t>
-      </w:r>
-      <w:r>
-        <w:t xml:space="preserve"> </w:t>
-      </w:r>
-      <m:oMath>
-        <m:sSub>
-          <m:e>
-            <m:r>
-              <m:rPr>
-                <m:sty m:val="p"/>
-              </m:rPr>
-              <m:t>F</m:t>
-            </m:r>
-            <m:r>
-              <m:rPr>
-                <m:sty m:val="p"/>
-              </m:rPr>
-              <m:t>A</m:t>
-            </m:r>
-          </m:e>
-          <m:sub>
-            <m:r>
-              <m:rPr>
-                <m:sty m:val="p"/>
-              </m:rPr>
-              <m:t>u</m:t>
-            </m:r>
-          </m:sub>
-        </m:sSub>
-        <m:r>
-          <m:rPr>
-            <m:sty m:val="p"/>
-          </m:rPr>
-          <m:t>=</m:t>
-        </m:r>
-        <m:r>
-          <m:t>0</m:t>
-        </m:r>
-      </m:oMath>
-      <w:r>
-        <w:t xml:space="preserve"> </w:t>
-      </w:r>
-      <w:r>
-        <w:t xml:space="preserve">every seed; with EATA the margin is inconclusive; and with the</w:t>
-      </w:r>
-      <w:r>
-        <w:t xml:space="preserve"> </w:t>
-      </w:r>
-      <w:r>
-        <w:t xml:space="preserve">aggressive helpful-dominated SAR arm KGA over-freezes (worse than always-adapt,</w:t>
-      </w:r>
-      <w:r>
-        <w:t xml:space="preserve"> </w:t>
-      </w:r>
-      <m:oMath>
-        <m:sSub>
-          <m:e>
-            <m:r>
-              <m:rPr>
-                <m:sty m:val="p"/>
-              </m:rPr>
-              <m:t>F</m:t>
-            </m:r>
-            <m:r>
-              <m:rPr>
-                <m:sty m:val="p"/>
-              </m:rPr>
-              <m:t>A</m:t>
-            </m:r>
-          </m:e>
-          <m:sub>
-            <m:r>
-              <m:rPr>
-                <m:sty m:val="p"/>
-              </m:rPr>
-              <m:t>u</m:t>
-            </m:r>
-          </m:sub>
-        </m:sSub>
-      </m:oMath>
-      <w:r>
-        <w:t xml:space="preserve"> </w:t>
-      </w:r>
-      <w:r>
-        <w:t xml:space="preserve">up to</w:t>
-      </w:r>
-      <w:r>
-        <w:t xml:space="preserve"> </w:t>
-      </w:r>
-      <m:oMath>
-        <m:r>
-          <m:t>0.11</m:t>
-        </m:r>
-      </m:oMath>
-      <w:r>
-        <w:t xml:space="preserve">), consistent with the candidate dependence seen elsewhere.</w:t>
-      </w:r>
-      <w:r>
-        <w:t xml:space="preserve"> </w:t>
-      </w:r>
-      <w:r>
-        <w:t xml:space="preserve">Per-seed multi-seed replays for iWildCam, Office-Home, and RxRx1 are single-run in the current</w:t>
-      </w:r>
-      <w:r>
-        <w:t xml:space="preserve"> </w:t>
-      </w:r>
-      <w:r>
-        <w:t xml:space="preserve">artifacts and remain future work.</w:t>
+        <w:t>The one natural-shift track with per-condition logs at multiple seeds is Camelyon17 (4 seeds, 9 composition-stress conditions per seed). The committed logs under experiments/kbound/results/camelyon17_multiseed_v1/ reproduce the candidate-dependent result: Tent is stable no-harm with FA_u=0 across seeds, EATA is inconclusive, and the helpful-dominated SAR arm over-freezes with FA_u up to 0.11. The recomputation uses scripts/recompute/multiseed_natural.py. iWildCam, Office-Home, and RxRx1 multi-seed replays remain future work.</w:t>
       </w:r>
     </w:p>
     <w:tbl>
@@ -34822,429 +33466,7 @@
         <w:pStyle w:val="FirstParagraph"/>
       </w:pPr>
       <w:r>
-        <w:t xml:space="preserve">Two label-free evidence panels are used, matched to the two calibration regimes of</w:t>
-      </w:r>
-      <w:r>
-        <w:t xml:space="preserve"> </w:t>
-      </w:r>
-      <w:r>
-        <w:t xml:space="preserve">§</w:t>
-      </w:r>
-      <w:hyperlink w:anchor="sec:method">
-        <w:r>
-          <w:rPr>
-            <w:rStyle w:val="Hyperlink"/>
-          </w:rPr>
-          <w:t xml:space="preserve">5</w:t>
-        </w:r>
-      </w:hyperlink>
-      <w:r>
-        <w:t xml:space="preserve">. Notation:</w:t>
-      </w:r>
-      <w:r>
-        <w:t xml:space="preserve"> </w:t>
-      </w:r>
-      <m:oMath>
-        <m:sSub>
-          <m:e>
-            <m:r>
-              <m:t>p</m:t>
-            </m:r>
-          </m:e>
-          <m:sub>
-            <m:r>
-              <m:t>0</m:t>
-            </m:r>
-          </m:sub>
-        </m:sSub>
-        <m:r>
-          <m:rPr>
-            <m:sty m:val="p"/>
-          </m:rPr>
-          <m:t>,</m:t>
-        </m:r>
-        <m:sSub>
-          <m:e>
-            <m:r>
-              <m:t>p</m:t>
-            </m:r>
-          </m:e>
-          <m:sub>
-            <m:r>
-              <m:t>a</m:t>
-            </m:r>
-          </m:sub>
-        </m:sSub>
-      </m:oMath>
-      <w:r>
-        <w:t xml:space="preserve"> </w:t>
-      </w:r>
-      <w:r>
-        <w:t xml:space="preserve">are the frozen and adapted softmax rows on the adaptation</w:t>
-      </w:r>
-      <w:r>
-        <w:t xml:space="preserve"> </w:t>
-      </w:r>
-      <w:r>
-        <w:t xml:space="preserve">batch;</w:t>
-      </w:r>
-      <w:r>
-        <w:t xml:space="preserve"> </w:t>
-      </w:r>
-      <m:oMath>
-        <m:sSub>
-          <m:e>
-            <m:acc>
-              <m:accPr>
-                <m:chr m:val="‾"/>
-              </m:accPr>
-              <m:e>
-                <m:r>
-                  <m:t>m</m:t>
-                </m:r>
-              </m:e>
-            </m:acc>
-          </m:e>
-          <m:sub>
-            <m:r>
-              <m:t>0</m:t>
-            </m:r>
-          </m:sub>
-        </m:sSub>
-        <m:r>
-          <m:rPr>
-            <m:sty m:val="p"/>
-          </m:rPr>
-          <m:t>=</m:t>
-        </m:r>
-        <m:sSub>
-          <m:e>
-            <m:r>
-              <m:rPr>
-                <m:sty m:val="p"/>
-              </m:rPr>
-              <m:t>m</m:t>
-            </m:r>
-            <m:r>
-              <m:rPr>
-                <m:sty m:val="p"/>
-              </m:rPr>
-              <m:t>e</m:t>
-            </m:r>
-            <m:r>
-              <m:rPr>
-                <m:sty m:val="p"/>
-              </m:rPr>
-              <m:t>a</m:t>
-            </m:r>
-            <m:r>
-              <m:rPr>
-                <m:sty m:val="p"/>
-              </m:rPr>
-              <m:t>n</m:t>
-            </m:r>
-          </m:e>
-          <m:sub>
-            <m:r>
-              <m:t>n</m:t>
-            </m:r>
-          </m:sub>
-        </m:sSub>
-        <m:r>
-          <m:t> </m:t>
-        </m:r>
-        <m:sSub>
-          <m:e>
-            <m:r>
-              <m:t>p</m:t>
-            </m:r>
-          </m:e>
-          <m:sub>
-            <m:r>
-              <m:t>0</m:t>
-            </m:r>
-            <m:r>
-              <m:rPr>
-                <m:sty m:val="p"/>
-              </m:rPr>
-              <m:t>,</m:t>
-            </m:r>
-            <m:r>
-              <m:t>n</m:t>
-            </m:r>
-          </m:sub>
-        </m:sSub>
-      </m:oMath>
-      <w:r>
-        <w:t xml:space="preserve"> </w:t>
-      </w:r>
-      <w:r>
-        <w:t xml:space="preserve">and</w:t>
-      </w:r>
-      <w:r>
-        <w:t xml:space="preserve"> </w:t>
-      </w:r>
-      <m:oMath>
-        <m:sSub>
-          <m:e>
-            <m:acc>
-              <m:accPr>
-                <m:chr m:val="‾"/>
-              </m:accPr>
-              <m:e>
-                <m:r>
-                  <m:t>m</m:t>
-                </m:r>
-              </m:e>
-            </m:acc>
-          </m:e>
-          <m:sub>
-            <m:r>
-              <m:t>a</m:t>
-            </m:r>
-          </m:sub>
-        </m:sSub>
-      </m:oMath>
-      <w:r>
-        <w:t xml:space="preserve"> </w:t>
-      </w:r>
-      <w:r>
-        <w:t xml:space="preserve">are the predicted-class marginals;</w:t>
-      </w:r>
-      <w:r>
-        <w:t xml:space="preserve"> </w:t>
-      </w:r>
-      <m:oMath>
-        <m:r>
-          <m:t>H</m:t>
-        </m:r>
-        <m:r>
-          <m:rPr>
-            <m:sty m:val="p"/>
-          </m:rPr>
-          <m:t>(</m:t>
-        </m:r>
-        <m:r>
-          <m:t>p</m:t>
-        </m:r>
-        <m:r>
-          <m:rPr>
-            <m:sty m:val="p"/>
-          </m:rPr>
-          <m:t>)</m:t>
-        </m:r>
-        <m:r>
-          <m:rPr>
-            <m:sty m:val="p"/>
-          </m:rPr>
-          <m:t>=</m:t>
-        </m:r>
-        <m:r>
-          <m:rPr>
-            <m:sty m:val="p"/>
-          </m:rPr>
-          <m:t>−</m:t>
-        </m:r>
-        <m:nary>
-          <m:naryPr>
-            <m:chr m:val="∑"/>
-            <m:limLoc m:val="undOvr"/>
-            <m:subHide m:val="off"/>
-            <m:supHide m:val="on"/>
-          </m:naryPr>
-          <m:sub>
-            <m:r>
-              <m:t>c</m:t>
-            </m:r>
-          </m:sub>
-          <m:sup>
-            <m:r>
-              <m:t>​</m:t>
-            </m:r>
-          </m:sup>
-          <m:e>
-            <m:sSub>
-              <m:e>
-                <m:r>
-                  <m:t>p</m:t>
-                </m:r>
-              </m:e>
-              <m:sub>
-                <m:r>
-                  <m:t>c</m:t>
-                </m:r>
-              </m:sub>
-            </m:sSub>
-          </m:e>
-        </m:nary>
-        <m:r>
-          <m:rPr>
-            <m:sty m:val="p"/>
-          </m:rPr>
-          <m:t>log</m:t>
-        </m:r>
-        <m:sSub>
-          <m:e>
-            <m:r>
-              <m:t>p</m:t>
-            </m:r>
-          </m:e>
-          <m:sub>
-            <m:r>
-              <m:t>c</m:t>
-            </m:r>
-          </m:sub>
-        </m:sSub>
-      </m:oMath>
-      <w:r>
-        <w:t xml:space="preserve">;</w:t>
-      </w:r>
-      <w:r>
-        <w:t xml:space="preserve"> </w:t>
-      </w:r>
-      <m:oMath>
-        <m:r>
-          <m:t>C</m:t>
-        </m:r>
-      </m:oMath>
-      <w:r>
-        <w:t xml:space="preserve"> </w:t>
-      </w:r>
-      <w:r>
-        <w:t xml:space="preserve">is the number of classes. The stress-grid tracks (CIFAR-10-C,</w:t>
-      </w:r>
-      <w:r>
-        <w:t xml:space="preserve"> </w:t>
-      </w:r>
-      <w:r>
-        <w:t xml:space="preserve">ImageNet-C, PACS) use the</w:t>
-      </w:r>
-      <w:r>
-        <w:t xml:space="preserve"> </w:t>
-      </w:r>
-      <m:oMath>
-        <m:r>
-          <m:t>11</m:t>
-        </m:r>
-      </m:oMath>
-      <w:r>
-        <w:t xml:space="preserve">-dimensional base panel of Table </w:t>
-      </w:r>
-      <w:hyperlink w:anchor="tab:schema-base">
-        <w:r>
-          <w:rPr>
-            <w:rStyle w:val="Hyperlink"/>
-          </w:rPr>
-          <w:t xml:space="preserve">9</w:t>
-        </w:r>
-      </w:hyperlink>
-      <w:r>
-        <w:t xml:space="preserve"> </w:t>
-      </w:r>
-      <w:r>
-        <w:t xml:space="preserve">(</w:t>
-      </w:r>
-      <w:r>
-        <w:rPr>
-          <w:rStyle w:val="VerbatimChar"/>
-        </w:rPr>
-        <w:t xml:space="preserve">kbound_pkg/kbound/evidence.py</w:t>
-      </w:r>
-      <w:r>
-        <w:t xml:space="preserve">). The natural-shift tracks (Camelyon17, iWildCam,</w:t>
-      </w:r>
-      <w:r>
-        <w:t xml:space="preserve"> </w:t>
-      </w:r>
-      <w:r>
-        <w:t xml:space="preserve">Office-Home, RxRx1) use the</w:t>
-      </w:r>
-      <w:r>
-        <w:t xml:space="preserve"> </w:t>
-      </w:r>
-      <m:oMath>
-        <m:r>
-          <m:t>16</m:t>
-        </m:r>
-      </m:oMath>
-      <w:r>
-        <w:t xml:space="preserve">-dimensional panel of Table </w:t>
-      </w:r>
-      <w:hyperlink w:anchor="tab:schema-rich">
-        <w:r>
-          <w:rPr>
-            <w:rStyle w:val="Hyperlink"/>
-          </w:rPr>
-          <w:t xml:space="preserve">XXIII</w:t>
-        </w:r>
-      </w:hyperlink>
-      <w:r>
-        <w:t xml:space="preserve">: a</w:t>
-      </w:r>
-      <w:r>
-        <w:t xml:space="preserve"> </w:t>
-      </w:r>
-      <m:oMath>
-        <m:r>
-          <m:t>10</m:t>
-        </m:r>
-      </m:oMath>
-      <w:r>
-        <w:t xml:space="preserve">-statistic</w:t>
-      </w:r>
-      <w:r>
-        <w:t xml:space="preserve"> </w:t>
-      </w:r>
-      <w:r>
-        <w:t xml:space="preserve">frozen-logit summary plus a</w:t>
-      </w:r>
-      <w:r>
-        <w:t xml:space="preserve"> </w:t>
-      </w:r>
-      <m:oMath>
-        <m:r>
-          <m:t>6</m:t>
-        </m:r>
-      </m:oMath>
-      <w:r>
-        <w:t xml:space="preserve">-feature rich panel (</w:t>
-      </w:r>
-      <w:r>
-        <w:rPr>
-          <w:rStyle w:val="VerbatimChar"/>
-        </w:rPr>
-        <w:t xml:space="preserve">scripts/run_wilds_camelyon17.py</w:t>
-      </w:r>
-      <w:r>
-        <w:t xml:space="preserve">). All</w:t>
-      </w:r>
-      <w:r>
-        <w:t xml:space="preserve"> </w:t>
-      </w:r>
-      <w:r>
-        <w:t xml:space="preserve">features are target-label-free; the ATC feature calibrates its threshold on</w:t>
-      </w:r>
-      <w:r>
-        <w:t xml:space="preserve"> </w:t>
-      </w:r>
-      <w:r>
-        <w:rPr>
-          <w:i/>
-          <w:iCs/>
-        </w:rPr>
-        <w:t xml:space="preserve">source</w:t>
-      </w:r>
-      <w:r>
-        <w:t xml:space="preserve"> </w:t>
-      </w:r>
-      <w:r>
-        <w:t xml:space="preserve">labels</w:t>
-      </w:r>
-      <w:r>
-        <w:t xml:space="preserve"> </w:t>
-      </w:r>
-      <w:r>
-        <w:t xml:space="preserve">only.</w:t>
+        <w:t>The promoted per-condition artifacts use the 11-feature label-free evidence panel implemented in kbound_pkg/kbound/evidence.py. The retained Camelyon17 multi-seed logs record the same ordered vector. Tracks available only through reconciled summary artifacts are not used to claim a richer feature schema.</w:t>
       </w:r>
     </w:p>
     <w:bookmarkStart w:id="130" w:name="tab:schema-base"/>
@@ -35253,18 +33475,7 @@
         <w:pStyle w:val="TableCaption"/>
       </w:pPr>
       <w:r>
-        <w:t xml:space="preserve">Base</w:t>
-      </w:r>
-      <w:r>
-        <w:t xml:space="preserve"> </w:t>
-      </w:r>
-      <m:oMath>
-        <m:r>
-          <m:t>11</m:t>
-        </m:r>
-      </m:oMath>
-      <w:r>
-        <w:t xml:space="preserve">-dim evidence panel (stress grids).</w:t>
+        <w:t>Promoted 11-dimensional evidence panel.</w:t>
       </w:r>
     </w:p>
     <w:tbl>
@@ -36447,1262 +34658,7 @@
       <w:pPr>
         <w:pStyle w:val="BodyText"/>
       </w:pPr>
-      <w:r>
-        <w:t xml:space="preserve">@llp</w:t>
-      </w:r>
-      <w:r>
-        <w:t xml:space="preserve">0.26</w:t>
-      </w:r>
-      <w:r>
-        <w:t xml:space="preserve">@</w:t>
-      </w:r>
-      <w:r>
-        <w:t xml:space="preserve"> </w:t>
-      </w:r>
-      <w:r>
-        <w:t xml:space="preserve">Feature &amp; Definition &amp; Family</w:t>
-      </w:r>
-      <w:r>
-        <w:br/>
-      </w:r>
-      <w:r>
-        <w:br/>
-      </w:r>
-      <w:r>
-        <w:t xml:space="preserve">ent mean/std &amp;</w:t>
-      </w:r>
-      <w:r>
-        <w:t xml:space="preserve"> </w:t>
-      </w:r>
-      <m:oMath>
-        <m:r>
-          <m:rPr>
-            <m:sty m:val="p"/>
-          </m:rPr>
-          <m:t>m</m:t>
-        </m:r>
-        <m:r>
-          <m:rPr>
-            <m:sty m:val="p"/>
-          </m:rPr>
-          <m:t>e</m:t>
-        </m:r>
-        <m:r>
-          <m:rPr>
-            <m:sty m:val="p"/>
-          </m:rPr>
-          <m:t>a</m:t>
-        </m:r>
-        <m:r>
-          <m:rPr>
-            <m:sty m:val="p"/>
-          </m:rPr>
-          <m:t>n</m:t>
-        </m:r>
-        <m:r>
-          <m:rPr>
-            <m:sty m:val="p"/>
-          </m:rPr>
-          <m:t>/</m:t>
-        </m:r>
-        <m:r>
-          <m:rPr>
-            <m:sty m:val="p"/>
-          </m:rPr>
-          <m:t>s</m:t>
-        </m:r>
-        <m:r>
-          <m:rPr>
-            <m:sty m:val="p"/>
-          </m:rPr>
-          <m:t>t</m:t>
-        </m:r>
-        <m:r>
-          <m:rPr>
-            <m:sty m:val="p"/>
-          </m:rPr>
-          <m:t>d</m:t>
-        </m:r>
-        <m:r>
-          <m:t> </m:t>
-        </m:r>
-        <m:r>
-          <m:t>H</m:t>
-        </m:r>
-      </m:oMath>
-      <w:r>
-        <w:t xml:space="preserve"> </w:t>
-      </w:r>
-      <w:r>
-        <w:t xml:space="preserve">&amp; frozen</w:t>
-      </w:r>
-      <w:r>
-        <w:br/>
-      </w:r>
-      <w:r>
-        <w:t xml:space="preserve">ent p25/p75 &amp;</w:t>
-      </w:r>
-      <w:r>
-        <w:t xml:space="preserve"> </w:t>
-      </w:r>
-      <m:oMath>
-        <m:r>
-          <m:t>25</m:t>
-        </m:r>
-        <m:r>
-          <m:rPr>
-            <m:sty m:val="p"/>
-          </m:rPr>
-          <m:t>/</m:t>
-        </m:r>
-        <m:r>
-          <m:t>75</m:t>
-        </m:r>
-      </m:oMath>
-      <w:r>
-        <w:t xml:space="preserve"> </w:t>
-      </w:r>
-      <w:r>
-        <w:t xml:space="preserve">pct. of</w:t>
-      </w:r>
-      <w:r>
-        <w:t xml:space="preserve"> </w:t>
-      </w:r>
-      <m:oMath>
-        <m:r>
-          <m:t>H</m:t>
-        </m:r>
-      </m:oMath>
-      <w:r>
-        <w:t xml:space="preserve"> </w:t>
-      </w:r>
-      <w:r>
-        <w:t xml:space="preserve">&amp; frozen</w:t>
-      </w:r>
-      <w:r>
-        <w:br/>
-      </w:r>
-      <w:r>
-        <w:t xml:space="preserve">conf mean/std &amp;</w:t>
-      </w:r>
-      <w:r>
-        <w:t xml:space="preserve"> </w:t>
-      </w:r>
-      <m:oMath>
-        <m:r>
-          <m:rPr>
-            <m:sty m:val="p"/>
-          </m:rPr>
-          <m:t>m</m:t>
-        </m:r>
-        <m:r>
-          <m:rPr>
-            <m:sty m:val="p"/>
-          </m:rPr>
-          <m:t>e</m:t>
-        </m:r>
-        <m:r>
-          <m:rPr>
-            <m:sty m:val="p"/>
-          </m:rPr>
-          <m:t>a</m:t>
-        </m:r>
-        <m:r>
-          <m:rPr>
-            <m:sty m:val="p"/>
-          </m:rPr>
-          <m:t>n</m:t>
-        </m:r>
-        <m:r>
-          <m:rPr>
-            <m:sty m:val="p"/>
-          </m:rPr>
-          <m:t>/</m:t>
-        </m:r>
-        <m:r>
-          <m:rPr>
-            <m:sty m:val="p"/>
-          </m:rPr>
-          <m:t>s</m:t>
-        </m:r>
-        <m:r>
-          <m:rPr>
-            <m:sty m:val="p"/>
-          </m:rPr>
-          <m:t>t</m:t>
-        </m:r>
-        <m:r>
-          <m:rPr>
-            <m:sty m:val="p"/>
-          </m:rPr>
-          <m:t>d</m:t>
-        </m:r>
-        <m:r>
-          <m:t> </m:t>
-        </m:r>
-        <m:r>
-          <m:t>s</m:t>
-        </m:r>
-      </m:oMath>
-      <w:r>
-        <w:t xml:space="preserve"> </w:t>
-      </w:r>
-      <w:r>
-        <w:t xml:space="preserve">&amp; frozen</w:t>
-      </w:r>
-      <w:r>
-        <w:br/>
-      </w:r>
-      <w:r>
-        <w:t xml:space="preserve">frac hi-conf &amp;</w:t>
-      </w:r>
-      <w:r>
-        <w:t xml:space="preserve"> </w:t>
-      </w:r>
-      <m:oMath>
-        <m:r>
-          <m:rPr>
-            <m:sty m:val="p"/>
-          </m:rPr>
-          <m:t>f</m:t>
-        </m:r>
-        <m:r>
-          <m:rPr>
-            <m:sty m:val="p"/>
-          </m:rPr>
-          <m:t>r</m:t>
-        </m:r>
-        <m:r>
-          <m:rPr>
-            <m:sty m:val="p"/>
-          </m:rPr>
-          <m:t>a</m:t>
-        </m:r>
-        <m:r>
-          <m:rPr>
-            <m:sty m:val="p"/>
-          </m:rPr>
-          <m:t>c</m:t>
-        </m:r>
-        <m:r>
-          <m:rPr>
-            <m:sty m:val="p"/>
-          </m:rPr>
-          <m:t>(</m:t>
-        </m:r>
-        <m:r>
-          <m:t>s</m:t>
-        </m:r>
-        <m:r>
-          <m:rPr>
-            <m:sty m:val="p"/>
-          </m:rPr>
-          <m:t>&gt;</m:t>
-        </m:r>
-        <m:r>
-          <m:t>0.9</m:t>
-        </m:r>
-        <m:r>
-          <m:rPr>
-            <m:sty m:val="p"/>
-          </m:rPr>
-          <m:t>)</m:t>
-        </m:r>
-      </m:oMath>
-      <w:r>
-        <w:t xml:space="preserve"> </w:t>
-      </w:r>
-      <w:r>
-        <w:t xml:space="preserve">&amp; frozen</w:t>
-      </w:r>
-      <w:r>
-        <w:br/>
-      </w:r>
-      <w:r>
-        <w:t xml:space="preserve">frac hi-ent &amp;</w:t>
-      </w:r>
-      <w:r>
-        <w:t xml:space="preserve"> </w:t>
-      </w:r>
-      <m:oMath>
-        <m:r>
-          <m:rPr>
-            <m:sty m:val="p"/>
-          </m:rPr>
-          <m:t>f</m:t>
-        </m:r>
-        <m:r>
-          <m:rPr>
-            <m:sty m:val="p"/>
-          </m:rPr>
-          <m:t>r</m:t>
-        </m:r>
-        <m:r>
-          <m:rPr>
-            <m:sty m:val="p"/>
-          </m:rPr>
-          <m:t>a</m:t>
-        </m:r>
-        <m:r>
-          <m:rPr>
-            <m:sty m:val="p"/>
-          </m:rPr>
-          <m:t>c</m:t>
-        </m:r>
-        <m:r>
-          <m:rPr>
-            <m:sty m:val="p"/>
-          </m:rPr>
-          <m:t>(</m:t>
-        </m:r>
-        <m:r>
-          <m:t>H</m:t>
-        </m:r>
-        <m:r>
-          <m:rPr>
-            <m:sty m:val="p"/>
-          </m:rPr>
-          <m:t>&gt;</m:t>
-        </m:r>
-        <m:r>
-          <m:rPr>
-            <m:sty m:val="p"/>
-          </m:rPr>
-          <m:t>log</m:t>
-        </m:r>
-        <m:r>
-          <m:t>2</m:t>
-        </m:r>
-        <m:r>
-          <m:rPr>
-            <m:sty m:val="p"/>
-          </m:rPr>
-          <m:t>)</m:t>
-        </m:r>
-      </m:oMath>
-      <w:r>
-        <w:t xml:space="preserve"> </w:t>
-      </w:r>
-      <w:r>
-        <w:t xml:space="preserve">&amp; frozen</w:t>
-      </w:r>
-      <w:r>
-        <w:br/>
-      </w:r>
-      <w:r>
-        <w:t xml:space="preserve">marg. max &amp;</w:t>
-      </w:r>
-      <w:r>
-        <w:t xml:space="preserve"> </w:t>
-      </w:r>
-      <m:oMath>
-        <m:sSub>
-          <m:e>
-            <m:r>
-              <m:rPr>
-                <m:sty m:val="p"/>
-              </m:rPr>
-              <m:t>max</m:t>
-            </m:r>
-          </m:e>
-          <m:sub>
-            <m:r>
-              <m:t>c</m:t>
-            </m:r>
-          </m:sub>
-        </m:sSub>
-        <m:sSub>
-          <m:e>
-            <m:r>
-              <m:rPr>
-                <m:sty m:val="p"/>
-              </m:rPr>
-              <m:t>m</m:t>
-            </m:r>
-            <m:r>
-              <m:rPr>
-                <m:sty m:val="p"/>
-              </m:rPr>
-              <m:t>e</m:t>
-            </m:r>
-            <m:r>
-              <m:rPr>
-                <m:sty m:val="p"/>
-              </m:rPr>
-              <m:t>a</m:t>
-            </m:r>
-            <m:r>
-              <m:rPr>
-                <m:sty m:val="p"/>
-              </m:rPr>
-              <m:t>n</m:t>
-            </m:r>
-          </m:e>
-          <m:sub>
-            <m:r>
-              <m:t>n</m:t>
-            </m:r>
-          </m:sub>
-        </m:sSub>
-        <m:r>
-          <m:t> </m:t>
-        </m:r>
-        <m:r>
-          <m:t>p</m:t>
-        </m:r>
-      </m:oMath>
-      <w:r>
-        <w:t xml:space="preserve"> </w:t>
-      </w:r>
-      <w:r>
-        <w:t xml:space="preserve">&amp; frozen marginal</w:t>
-      </w:r>
-      <w:r>
-        <w:br/>
-      </w:r>
-      <w:r>
-        <w:t xml:space="preserve">marg. std &amp;</w:t>
-      </w:r>
-      <w:r>
-        <w:t xml:space="preserve"> </w:t>
-      </w:r>
-      <m:oMath>
-        <m:sSub>
-          <m:e>
-            <m:r>
-              <m:rPr>
-                <m:sty m:val="p"/>
-              </m:rPr>
-              <m:t>s</m:t>
-            </m:r>
-            <m:r>
-              <m:rPr>
-                <m:sty m:val="p"/>
-              </m:rPr>
-              <m:t>t</m:t>
-            </m:r>
-            <m:r>
-              <m:rPr>
-                <m:sty m:val="p"/>
-              </m:rPr>
-              <m:t>d</m:t>
-            </m:r>
-          </m:e>
-          <m:sub>
-            <m:r>
-              <m:t>c</m:t>
-            </m:r>
-          </m:sub>
-        </m:sSub>
-        <m:sSub>
-          <m:e>
-            <m:r>
-              <m:rPr>
-                <m:sty m:val="p"/>
-              </m:rPr>
-              <m:t>m</m:t>
-            </m:r>
-            <m:r>
-              <m:rPr>
-                <m:sty m:val="p"/>
-              </m:rPr>
-              <m:t>e</m:t>
-            </m:r>
-            <m:r>
-              <m:rPr>
-                <m:sty m:val="p"/>
-              </m:rPr>
-              <m:t>a</m:t>
-            </m:r>
-            <m:r>
-              <m:rPr>
-                <m:sty m:val="p"/>
-              </m:rPr>
-              <m:t>n</m:t>
-            </m:r>
-          </m:e>
-          <m:sub>
-            <m:r>
-              <m:t>n</m:t>
-            </m:r>
-          </m:sub>
-        </m:sSub>
-        <m:r>
-          <m:t> </m:t>
-        </m:r>
-        <m:r>
-          <m:t>p</m:t>
-        </m:r>
-      </m:oMath>
-      <w:r>
-        <w:t xml:space="preserve"> </w:t>
-      </w:r>
-      <w:r>
-        <w:t xml:space="preserve">&amp; frozen marginal</w:t>
-      </w:r>
-      <w:r>
-        <w:br/>
-      </w:r>
-      <w:r>
-        <w:br/>
-      </w:r>
-      <w:r>
-        <w:rPr>
-          <w:rStyle w:val="VerbatimChar"/>
-        </w:rPr>
-        <w:t xml:space="preserve">disagree</w:t>
-      </w:r>
-      <w:r>
-        <w:t xml:space="preserve"> </w:t>
-      </w:r>
-      <w:r>
-        <w:t xml:space="preserve">&amp;</w:t>
-      </w:r>
-      <w:r>
-        <w:t xml:space="preserve"> </w:t>
-      </w:r>
-      <m:oMath>
-        <m:r>
-          <m:rPr>
-            <m:sty m:val="p"/>
-          </m:rPr>
-          <m:t>f</m:t>
-        </m:r>
-        <m:r>
-          <m:rPr>
-            <m:sty m:val="p"/>
-          </m:rPr>
-          <m:t>r</m:t>
-        </m:r>
-        <m:r>
-          <m:rPr>
-            <m:sty m:val="p"/>
-          </m:rPr>
-          <m:t>a</m:t>
-        </m:r>
-        <m:r>
-          <m:rPr>
-            <m:sty m:val="p"/>
-          </m:rPr>
-          <m:t>c</m:t>
-        </m:r>
-        <m:r>
-          <m:rPr>
-            <m:sty m:val="p"/>
-          </m:rPr>
-          <m:t>(</m:t>
-        </m:r>
-        <m:r>
-          <m:rPr>
-            <m:sty m:val="p"/>
-          </m:rPr>
-          <m:t>arg</m:t>
-        </m:r>
-        <m:r>
-          <m:rPr>
-            <m:sty m:val="p"/>
-          </m:rPr>
-          <m:t>max</m:t>
-        </m:r>
-        <m:sSub>
-          <m:e>
-            <m:r>
-              <m:t>f</m:t>
-            </m:r>
-          </m:e>
-          <m:sub>
-            <m:r>
-              <m:t>0</m:t>
-            </m:r>
-          </m:sub>
-        </m:sSub>
-        <m:r>
-          <m:t>​</m:t>
-        </m:r>
-        <m:r>
-          <m:rPr>
-            <m:sty m:val="p"/>
-          </m:rPr>
-          <m:t>≠</m:t>
-        </m:r>
-        <m:r>
-          <m:t>​</m:t>
-        </m:r>
-        <m:r>
-          <m:rPr>
-            <m:sty m:val="p"/>
-          </m:rPr>
-          <m:t>arg</m:t>
-        </m:r>
-        <m:r>
-          <m:rPr>
-            <m:sty m:val="p"/>
-          </m:rPr>
-          <m:t>max</m:t>
-        </m:r>
-        <m:sSub>
-          <m:e>
-            <m:r>
-              <m:t>f</m:t>
-            </m:r>
-          </m:e>
-          <m:sub>
-            <m:r>
-              <m:t>a</m:t>
-            </m:r>
-          </m:sub>
-        </m:sSub>
-        <m:r>
-          <m:rPr>
-            <m:sty m:val="p"/>
-          </m:rPr>
-          <m:t>)</m:t>
-        </m:r>
-      </m:oMath>
-      <w:r>
-        <w:t xml:space="preserve"> </w:t>
-      </w:r>
-      <w:r>
-        <w:t xml:space="preserve">&amp; disagreement</w:t>
-      </w:r>
-      <w:r>
-        <w:br/>
-      </w:r>
-      <w:r>
-        <w:rPr>
-          <w:rStyle w:val="VerbatimChar"/>
-        </w:rPr>
-        <w:t xml:space="preserve">ent_gap</w:t>
-      </w:r>
-      <w:r>
-        <w:t xml:space="preserve"> </w:t>
-      </w:r>
-      <w:r>
-        <w:t xml:space="preserve">&amp;</w:t>
-      </w:r>
-      <w:r>
-        <w:t xml:space="preserve"> </w:t>
-      </w:r>
-      <m:oMath>
-        <m:r>
-          <m:rPr>
-            <m:sty m:val="p"/>
-          </m:rPr>
-          <m:t>m</m:t>
-        </m:r>
-        <m:r>
-          <m:rPr>
-            <m:sty m:val="p"/>
-          </m:rPr>
-          <m:t>e</m:t>
-        </m:r>
-        <m:r>
-          <m:rPr>
-            <m:sty m:val="p"/>
-          </m:rPr>
-          <m:t>a</m:t>
-        </m:r>
-        <m:r>
-          <m:rPr>
-            <m:sty m:val="p"/>
-          </m:rPr>
-          <m:t>n</m:t>
-        </m:r>
-        <m:r>
-          <m:t> </m:t>
-        </m:r>
-        <m:r>
-          <m:t>H</m:t>
-        </m:r>
-        <m:r>
-          <m:rPr>
-            <m:sty m:val="p"/>
-          </m:rPr>
-          <m:t>(</m:t>
-        </m:r>
-        <m:sSub>
-          <m:e>
-            <m:r>
-              <m:t>f</m:t>
-            </m:r>
-          </m:e>
-          <m:sub>
-            <m:r>
-              <m:t>0</m:t>
-            </m:r>
-          </m:sub>
-        </m:sSub>
-        <m:r>
-          <m:rPr>
-            <m:sty m:val="p"/>
-          </m:rPr>
-          <m:t>)</m:t>
-        </m:r>
-        <m:r>
-          <m:rPr>
-            <m:sty m:val="p"/>
-          </m:rPr>
-          <m:t>−</m:t>
-        </m:r>
-        <m:r>
-          <m:rPr>
-            <m:sty m:val="p"/>
-          </m:rPr>
-          <m:t>m</m:t>
-        </m:r>
-        <m:r>
-          <m:rPr>
-            <m:sty m:val="p"/>
-          </m:rPr>
-          <m:t>e</m:t>
-        </m:r>
-        <m:r>
-          <m:rPr>
-            <m:sty m:val="p"/>
-          </m:rPr>
-          <m:t>a</m:t>
-        </m:r>
-        <m:r>
-          <m:rPr>
-            <m:sty m:val="p"/>
-          </m:rPr>
-          <m:t>n</m:t>
-        </m:r>
-        <m:r>
-          <m:t> </m:t>
-        </m:r>
-        <m:r>
-          <m:t>H</m:t>
-        </m:r>
-        <m:r>
-          <m:rPr>
-            <m:sty m:val="p"/>
-          </m:rPr>
-          <m:t>(</m:t>
-        </m:r>
-        <m:sSub>
-          <m:e>
-            <m:r>
-              <m:t>f</m:t>
-            </m:r>
-          </m:e>
-          <m:sub>
-            <m:r>
-              <m:t>a</m:t>
-            </m:r>
-          </m:sub>
-        </m:sSub>
-        <m:r>
-          <m:rPr>
-            <m:sty m:val="p"/>
-          </m:rPr>
-          <m:t>)</m:t>
-        </m:r>
-      </m:oMath>
-      <w:r>
-        <w:t xml:space="preserve"> </w:t>
-      </w:r>
-      <w:r>
-        <w:t xml:space="preserve">&amp; change</w:t>
-      </w:r>
-      <w:r>
-        <w:br/>
-      </w:r>
-      <w:r>
-        <w:rPr>
-          <w:rStyle w:val="VerbatimChar"/>
-        </w:rPr>
-        <w:t xml:space="preserve">en_shift</w:t>
-      </w:r>
-      <w:r>
-        <w:t xml:space="preserve">&amp;</w:t>
-      </w:r>
-      <w:r>
-        <w:t xml:space="preserve"> </w:t>
-      </w:r>
-      <m:oMath>
-        <m:r>
-          <m:rPr>
-            <m:sty m:val="p"/>
-          </m:rPr>
-          <m:t>m</m:t>
-        </m:r>
-        <m:r>
-          <m:rPr>
-            <m:sty m:val="p"/>
-          </m:rPr>
-          <m:t>e</m:t>
-        </m:r>
-        <m:r>
-          <m:rPr>
-            <m:sty m:val="p"/>
-          </m:rPr>
-          <m:t>a</m:t>
-        </m:r>
-        <m:r>
-          <m:rPr>
-            <m:sty m:val="p"/>
-          </m:rPr>
-          <m:t>n</m:t>
-        </m:r>
-        <m:r>
-          <m:t> </m:t>
-        </m:r>
-        <m:sSub>
-          <m:e>
-            <m:r>
-              <m:t>E</m:t>
-            </m:r>
-          </m:e>
-          <m:sub>
-            <m:r>
-              <m:t>t</m:t>
-            </m:r>
-          </m:sub>
-        </m:sSub>
-        <m:r>
-          <m:rPr>
-            <m:sty m:val="p"/>
-          </m:rPr>
-          <m:t>−</m:t>
-        </m:r>
-        <m:r>
-          <m:rPr>
-            <m:sty m:val="p"/>
-          </m:rPr>
-          <m:t>m</m:t>
-        </m:r>
-        <m:r>
-          <m:rPr>
-            <m:sty m:val="p"/>
-          </m:rPr>
-          <m:t>e</m:t>
-        </m:r>
-        <m:r>
-          <m:rPr>
-            <m:sty m:val="p"/>
-          </m:rPr>
-          <m:t>a</m:t>
-        </m:r>
-        <m:r>
-          <m:rPr>
-            <m:sty m:val="p"/>
-          </m:rPr>
-          <m:t>n</m:t>
-        </m:r>
-        <m:r>
-          <m:t> </m:t>
-        </m:r>
-        <m:sSub>
-          <m:e>
-            <m:r>
-              <m:t>E</m:t>
-            </m:r>
-          </m:e>
-          <m:sub>
-            <m:r>
-              <m:t>s</m:t>
-            </m:r>
-          </m:sub>
-        </m:sSub>
-      </m:oMath>
-      <w:r>
-        <w:t xml:space="preserve"> </w:t>
-      </w:r>
-      <w:r>
-        <w:t xml:space="preserve">&amp; drift</w:t>
-      </w:r>
-      <w:r>
-        <w:br/>
-      </w:r>
-      <w:r>
-        <w:rPr>
-          <w:rStyle w:val="VerbatimChar"/>
-        </w:rPr>
-        <w:t xml:space="preserve">bn_kl</w:t>
-      </w:r>
-      <w:r>
-        <w:t xml:space="preserve"> </w:t>
-      </w:r>
-      <w:r>
-        <w:t xml:space="preserve">&amp;</w:t>
-      </w:r>
-      <w:r>
-        <w:t xml:space="preserve"> </w:t>
-      </w:r>
-      <m:oMath>
-        <m:sSub>
-          <m:e>
-            <m:r>
-              <m:rPr>
-                <m:sty m:val="p"/>
-              </m:rPr>
-              <m:t>m</m:t>
-            </m:r>
-            <m:r>
-              <m:rPr>
-                <m:sty m:val="p"/>
-              </m:rPr>
-              <m:t>e</m:t>
-            </m:r>
-            <m:r>
-              <m:rPr>
-                <m:sty m:val="p"/>
-              </m:rPr>
-              <m:t>a</m:t>
-            </m:r>
-            <m:r>
-              <m:rPr>
-                <m:sty m:val="p"/>
-              </m:rPr>
-              <m:t>n</m:t>
-            </m:r>
-          </m:e>
-          <m:sub>
-            <m:r>
-              <m:rPr>
-                <m:sty m:val="p"/>
-              </m:rPr>
-              <m:t>c</m:t>
-            </m:r>
-            <m:r>
-              <m:rPr>
-                <m:sty m:val="p"/>
-              </m:rPr>
-              <m:t>h</m:t>
-            </m:r>
-          </m:sub>
-        </m:sSub>
-        <m:r>
-          <m:t> </m:t>
-        </m:r>
-        <m:r>
-          <m:rPr>
-            <m:sty m:val="p"/>
-          </m:rPr>
-          <m:t>K</m:t>
-        </m:r>
-        <m:r>
-          <m:rPr>
-            <m:sty m:val="p"/>
-          </m:rPr>
-          <m:t>L</m:t>
-        </m:r>
-        <m:r>
-          <m:rPr>
-            <m:sty m:val="p"/>
-          </m:rPr>
-          <m:t>(</m:t>
-        </m:r>
-        <m:sSub>
-          <m:e>
-            <m:r>
-              <m:rPr>
-                <m:scr m:val="script"/>
-                <m:sty m:val="p"/>
-              </m:rPr>
-              <m:t>N</m:t>
-            </m:r>
-          </m:e>
-          <m:sub>
-            <m:r>
-              <m:rPr>
-                <m:sty m:val="p"/>
-              </m:rPr>
-              <m:t>r</m:t>
-            </m:r>
-            <m:r>
-              <m:rPr>
-                <m:sty m:val="p"/>
-              </m:rPr>
-              <m:t>u</m:t>
-            </m:r>
-            <m:r>
-              <m:rPr>
-                <m:sty m:val="p"/>
-              </m:rPr>
-              <m:t>n</m:t>
-            </m:r>
-          </m:sub>
-        </m:sSub>
-        <m:r>
-          <m:t>​</m:t>
-        </m:r>
-        <m:r>
-          <m:rPr>
-            <m:sty m:val="p"/>
-          </m:rPr>
-          <m:t>∥</m:t>
-        </m:r>
-        <m:r>
-          <m:t>​</m:t>
-        </m:r>
-        <m:sSub>
-          <m:e>
-            <m:r>
-              <m:rPr>
-                <m:scr m:val="script"/>
-                <m:sty m:val="p"/>
-              </m:rPr>
-              <m:t>N</m:t>
-            </m:r>
-          </m:e>
-          <m:sub>
-            <m:r>
-              <m:rPr>
-                <m:sty m:val="p"/>
-              </m:rPr>
-              <m:t>b</m:t>
-            </m:r>
-            <m:r>
-              <m:rPr>
-                <m:sty m:val="p"/>
-              </m:rPr>
-              <m:t>a</m:t>
-            </m:r>
-            <m:r>
-              <m:rPr>
-                <m:sty m:val="p"/>
-              </m:rPr>
-              <m:t>t</m:t>
-            </m:r>
-            <m:r>
-              <m:rPr>
-                <m:sty m:val="p"/>
-              </m:rPr>
-              <m:t>c</m:t>
-            </m:r>
-            <m:r>
-              <m:rPr>
-                <m:sty m:val="p"/>
-              </m:rPr>
-              <m:t>h</m:t>
-            </m:r>
-          </m:sub>
-        </m:sSub>
-        <m:r>
-          <m:rPr>
-            <m:sty m:val="p"/>
-          </m:rPr>
-          <m:t>)</m:t>
-        </m:r>
-      </m:oMath>
-      <w:r>
-        <w:t xml:space="preserve"> </w:t>
-      </w:r>
-      <w:r>
-        <w:t xml:space="preserve">&amp; drift</w:t>
-      </w:r>
-      <w:r>
-        <w:br/>
-      </w:r>
-      <w:r>
-        <w:rPr>
-          <w:rStyle w:val="VerbatimChar"/>
-        </w:rPr>
-        <w:t xml:space="preserve">atc</w:t>
-      </w:r>
-      <w:r>
-        <w:t xml:space="preserve"> </w:t>
-      </w:r>
-      <w:r>
-        <w:t xml:space="preserve">&amp;</w:t>
-      </w:r>
-      <w:r>
-        <w:t xml:space="preserve"> </w:t>
-      </w:r>
-      <m:oMath>
-        <m:sSub>
-          <m:e>
-            <m:r>
-              <m:rPr>
-                <m:sty m:val="p"/>
-              </m:rPr>
-              <m:t>f</m:t>
-            </m:r>
-            <m:r>
-              <m:rPr>
-                <m:sty m:val="p"/>
-              </m:rPr>
-              <m:t>r</m:t>
-            </m:r>
-            <m:r>
-              <m:rPr>
-                <m:sty m:val="p"/>
-              </m:rPr>
-              <m:t>a</m:t>
-            </m:r>
-            <m:r>
-              <m:rPr>
-                <m:sty m:val="p"/>
-              </m:rPr>
-              <m:t>c</m:t>
-            </m:r>
-          </m:e>
-          <m:sub>
-            <m:r>
-              <m:t>t</m:t>
-            </m:r>
-          </m:sub>
-        </m:sSub>
-        <m:r>
-          <m:rPr>
-            <m:sty m:val="p"/>
-          </m:rPr>
-          <m:t>(</m:t>
-        </m:r>
-        <m:r>
-          <m:t>s</m:t>
-        </m:r>
-        <m:r>
-          <m:t>​</m:t>
-        </m:r>
-        <m:r>
-          <m:rPr>
-            <m:sty m:val="p"/>
-          </m:rPr>
-          <m:t>≥</m:t>
-        </m:r>
-        <m:r>
-          <m:t>​</m:t>
-        </m:r>
-        <m:r>
-          <m:t>t</m:t>
-        </m:r>
-        <m:r>
-          <m:rPr>
-            <m:sty m:val="p"/>
-          </m:rPr>
-          <m:t>)</m:t>
-        </m:r>
-      </m:oMath>
-      <w:r>
-        <w:t xml:space="preserve">,</w:t>
-      </w:r>
-      <w:r>
-        <w:t xml:space="preserve"> </w:t>
-      </w:r>
-      <m:oMath>
-        <m:r>
-          <m:t>t</m:t>
-        </m:r>
-      </m:oMath>
-      <w:r>
-        <w:t xml:space="preserve"> </w:t>
-      </w:r>
-      <w:r>
-        <w:t xml:space="preserve">src-calib. &amp; accuracy proxy</w:t>
-      </w:r>
-      <w:r>
-        <w:br/>
-      </w:r>
-      <w:r>
-        <w:rPr>
-          <w:rStyle w:val="VerbatimChar"/>
-        </w:rPr>
-        <w:t xml:space="preserve">conf_drop</w:t>
-      </w:r>
-      <w:r>
-        <w:t xml:space="preserve">&amp;</w:t>
-      </w:r>
-      <w:r>
-        <w:t xml:space="preserve"> </w:t>
-      </w:r>
-      <m:oMath>
-        <m:r>
-          <m:rPr>
-            <m:sty m:val="p"/>
-          </m:rPr>
-          <m:t>m</m:t>
-        </m:r>
-        <m:r>
-          <m:rPr>
-            <m:sty m:val="p"/>
-          </m:rPr>
-          <m:t>e</m:t>
-        </m:r>
-        <m:r>
-          <m:rPr>
-            <m:sty m:val="p"/>
-          </m:rPr>
-          <m:t>a</m:t>
-        </m:r>
-        <m:r>
-          <m:rPr>
-            <m:sty m:val="p"/>
-          </m:rPr>
-          <m:t>n</m:t>
-        </m:r>
-        <m:r>
-          <m:t> </m:t>
-        </m:r>
-        <m:sSub>
-          <m:e>
-            <m:r>
-              <m:t>s</m:t>
-            </m:r>
-          </m:e>
-          <m:sub>
-            <m:r>
-              <m:t>s</m:t>
-            </m:r>
-          </m:sub>
-        </m:sSub>
-        <m:r>
-          <m:rPr>
-            <m:sty m:val="p"/>
-          </m:rPr>
-          <m:t>−</m:t>
-        </m:r>
-        <m:r>
-          <m:rPr>
-            <m:sty m:val="p"/>
-          </m:rPr>
-          <m:t>m</m:t>
-        </m:r>
-        <m:r>
-          <m:rPr>
-            <m:sty m:val="p"/>
-          </m:rPr>
-          <m:t>e</m:t>
-        </m:r>
-        <m:r>
-          <m:rPr>
-            <m:sty m:val="p"/>
-          </m:rPr>
-          <m:t>a</m:t>
-        </m:r>
-        <m:r>
-          <m:rPr>
-            <m:sty m:val="p"/>
-          </m:rPr>
-          <m:t>n</m:t>
-        </m:r>
-        <m:r>
-          <m:t> </m:t>
-        </m:r>
-        <m:sSub>
-          <m:e>
-            <m:r>
-              <m:t>s</m:t>
-            </m:r>
-          </m:e>
-          <m:sub>
-            <m:r>
-              <m:t>t</m:t>
-            </m:r>
-          </m:sub>
-        </m:sSub>
-      </m:oMath>
-      <w:r>
-        <w:t xml:space="preserve"> </w:t>
-      </w:r>
-      <w:r>
-        <w:t xml:space="preserve">&amp; drift</w:t>
-      </w:r>
-      <w:r>
-        <w:br/>
-      </w:r>
+      <w:r/>
     </w:p>
     <w:bookmarkEnd w:id="131"/>
     <w:bookmarkStart w:id="136" w:name="app:theory-full"/>

</xml_diff>